<commit_message>
Say what "0 of 3 significant" does and does not establish
Section 3 reported the cage-contrast counts without saying how to read them.
Taken alone the column is weak: each contrast has 13-16 samples and very
little power, so a non-detection is not an absence, and writing it up as
"ecological features are unaffected by the cage effect" would overstate it.

Adds 3.1, which locates where the argument actually comes from -- the same
three contrasts at the same sample sizes give genus abundance 3 of 3, so equal
power with opposite outcomes places the difference in the feature space rather
than in n -- and notes that the pure ecological space does detect infection in
the same cohort, making this a positive control paired with a negative result
rather than a feature space that detects nothing.

Ends with wording suitable for a manuscript, so the distinction survives into
the paper. Both language versions and the Word file updated.

Co-Authored-By: Claude Opus 5 <noreply@anthropic.com>
</commit_message>
<xml_diff>
--- a/summary_ecological_models_CH.docx
+++ b/summary_ecological_models_CH.docx
@@ -3343,6 +3343,150 @@
       </w:r>
     </w:p>
     <w:p>
+      <w:pPr>
+        <w:pStyle w:val="Heading3"/>
+      </w:pPr>
+      <w:bookmarkStart w:id="25" w:name="怎么读以及论文中该怎么写"/>
+      <w:r>
+        <w:t xml:space="preserve">3.1 「0/3」怎么读，以及论文中该怎么写</w:t>
+      </w:r>
+      <w:bookmarkEnd w:id="25"/>
+    </w:p>
+    <w:p>
+      <w:pPr>
+        <w:pStyle w:val="FirstParagraph"/>
+      </w:pPr>
+      <w:r>
+        <w:rPr>
+          <w:b/>
+        </w:rPr>
+        <w:t xml:space="preserve">「0/3 显著」单独是弱证据。</w:t>
+      </w:r>
+      <w:r>
+        <w:t xml:space="preserve"> </w:t>
+      </w:r>
+      <w:r>
+        <w:t xml:space="preserve">每组对比只有 13–16 个样本，检验力很低 ——</w:t>
+      </w:r>
+      <w:r>
+        <w:t xml:space="preserve"> </w:t>
+      </w:r>
+      <w:r>
+        <w:rPr>
+          <w:b/>
+        </w:rPr>
+        <w:t xml:space="preserve">测不出来不等于不存在</w:t>
+      </w:r>
+      <w:r>
+        <w:t xml:space="preserve">。若只有生态特征这一列，不足以下结论。</w:t>
+      </w:r>
+    </w:p>
+    <w:p>
+      <w:pPr>
+        <w:pStyle w:val="BodyText"/>
+      </w:pPr>
+      <w:r>
+        <w:t xml:space="preserve">它之所以有分量，是因为</w:t>
+      </w:r>
+      <w:r>
+        <w:rPr>
+          <w:b/>
+        </w:rPr>
+        <w:t xml:space="preserve">同样的三组对比、同样的样本量、同样的置换流程，属丰度拿到了 3/3</w:t>
+      </w:r>
+      <w:r>
+        <w:t xml:space="preserve">：</w:t>
+      </w:r>
+    </w:p>
+    <w:p>
+      <w:pPr>
+        <w:pStyle w:val="SourceCode"/>
+      </w:pPr>
+      <w:r>
+        <w:rPr>
+          <w:rStyle w:val="VerbatimChar"/>
+        </w:rPr>
+        <w:t xml:space="preserve">同为 n=16 的隔离器 3 vs 4：</w:t>
+      </w:r>
+      <w:r>
+        <w:br/>
+      </w:r>
+      <w:r>
+        <w:rPr>
+          <w:rStyle w:val="VerbatimChar"/>
+        </w:rPr>
+        <w:t xml:space="preserve">    属丰度     AUC 0.919   p = 0.0066    ← 测得出</w:t>
+      </w:r>
+      <w:r>
+        <w:br/>
+      </w:r>
+      <w:r>
+        <w:rPr>
+          <w:rStyle w:val="VerbatimChar"/>
+        </w:rPr>
+        <w:t xml:space="preserve">    纯生态     AUC 0.556   p = 0.3987    ← 测不出</w:t>
+      </w:r>
+    </w:p>
+    <w:p>
+      <w:pPr>
+        <w:pStyle w:val="FirstParagraph"/>
+      </w:pPr>
+      <w:r>
+        <w:t xml:space="preserve">检验力相同而结果相反，说明差别在</w:t>
+      </w:r>
+      <w:r>
+        <w:rPr>
+          <w:b/>
+        </w:rPr>
+        <w:t xml:space="preserve">特征空间本身</w:t>
+      </w:r>
+      <w:r>
+        <w:t xml:space="preserve">，不在样本量。</w:t>
+      </w:r>
+    </w:p>
+    <w:p>
+      <w:pPr>
+        <w:pStyle w:val="BodyText"/>
+      </w:pPr>
+      <w:r>
+        <w:t xml:space="preserve">同时纯生态对感染是测得出的（0.784，p=0.0100），因此这是一个「</w:t>
+      </w:r>
+      <w:r>
+        <w:rPr>
+          <w:b/>
+        </w:rPr>
+        <w:t xml:space="preserve">阳性对照 + 阴性结果</w:t>
+      </w:r>
+      <w:r>
+        <w:t xml:space="preserve">」的组合 —— 若某个特征空间对什么都测不出来，那只说明它无用；对感染测得出、对笼号测不出，这个组合才有信息量。</w:t>
+      </w:r>
+    </w:p>
+    <w:p>
+      <w:pPr>
+        <w:pStyle w:val="BlockText"/>
+      </w:pPr>
+      <w:r>
+        <w:rPr>
+          <w:b/>
+        </w:rPr>
+        <w:t xml:space="preserve">论文中的准确写法。</w:t>
+      </w:r>
+      <w:r>
+        <w:t xml:space="preserve"> </w:t>
+      </w:r>
+      <w:r>
+        <w:t xml:space="preserve">不要写成「生态特征不受笼效应影响」—— 那是把未检出说成不存在。建议：</w:t>
+      </w:r>
+    </w:p>
+    <w:p>
+      <w:pPr>
+        <w:pStyle w:val="BlockText"/>
+      </w:pPr>
+      <w:r>
+        <w:t xml:space="preserve">「在三组固定毒株、提取批次与感染状态的纯笼对比中（n=13–16），纯生态特征均未达到显著（p = 0.25–0.55），而属丰度在全部三组均显著（p = 0.007–0.033）。两者检验力相同，因此该差异反映特征空间的性质，而非样本量差异。」</w:t>
+      </w:r>
+    </w:p>
+    <w:p>
       <w:r>
         <w:pict>
           <v:rect style="width:0;height:1.5pt" o:hralign="center" o:hrstd="t" o:hr="t"/>
@@ -3353,11 +3497,11 @@
       <w:pPr>
         <w:pStyle w:val="Heading2"/>
       </w:pPr>
-      <w:bookmarkStart w:id="25" w:name="跨宿主迁移最初的问题在一个方向上得到回答"/>
+      <w:bookmarkStart w:id="26" w:name="跨宿主迁移最初的问题在一个方向上得到回答"/>
       <w:r>
         <w:t xml:space="preserve">4. 跨宿主迁移：最初的问题，在一个方向上得到回答</w:t>
       </w:r>
-      <w:bookmarkEnd w:id="25"/>
+      <w:bookmarkEnd w:id="26"/>
     </w:p>
     <w:p>
       <w:pPr>
@@ -3809,11 +3953,11 @@
       <w:pPr>
         <w:pStyle w:val="Heading3"/>
       </w:pPr>
-      <w:bookmarkStart w:id="26" w:name="鸭-火鸡这一格"/>
+      <w:bookmarkStart w:id="27" w:name="鸭-火鸡这一格"/>
       <w:r>
         <w:t xml:space="preserve">鸭 → 火鸡这一格</w:t>
       </w:r>
-      <w:bookmarkEnd w:id="26"/>
+      <w:bookmarkEnd w:id="27"/>
     </w:p>
     <w:p>
       <w:pPr>
@@ -3951,7 +4095,7 @@
       <w:pPr>
         <w:pStyle w:val="Heading3"/>
       </w:pPr>
-      <w:bookmarkStart w:id="27" w:name="这条结论不能确立什么"/>
+      <w:bookmarkStart w:id="28" w:name="这条结论不能确立什么"/>
       <w:r>
         <w:t xml:space="preserve">这条结论</w:t>
       </w:r>
@@ -3964,7 +4108,7 @@
       <w:r>
         <w:t xml:space="preserve">能确立什么</w:t>
       </w:r>
-      <w:bookmarkEnd w:id="27"/>
+      <w:bookmarkEnd w:id="28"/>
     </w:p>
     <w:p>
       <w:pPr>
@@ -4063,11 +4207,11 @@
       <w:pPr>
         <w:pStyle w:val="Heading2"/>
       </w:pPr>
-      <w:bookmarkStart w:id="28" w:name="α-核心里到底是什么在迁移"/>
+      <w:bookmarkStart w:id="29" w:name="α-核心里到底是什么在迁移"/>
       <w:r>
         <w:t xml:space="preserve">5. α + 核心里到底是什么在迁移</w:t>
       </w:r>
-      <w:bookmarkEnd w:id="28"/>
+      <w:bookmarkEnd w:id="29"/>
     </w:p>
     <w:p>
       <w:pPr>
@@ -4135,11 +4279,11 @@
       <w:pPr>
         <w:pStyle w:val="Heading3"/>
       </w:pPr>
-      <w:bookmarkStart w:id="29" w:name="障碍是-rbf-核不是特征"/>
+      <w:bookmarkStart w:id="30" w:name="障碍是-rbf-核不是特征"/>
       <w:r>
         <w:t xml:space="preserve">5.1 障碍是 RBF 核，不是特征</w:t>
       </w:r>
-      <w:bookmarkEnd w:id="29"/>
+      <w:bookmarkEnd w:id="30"/>
     </w:p>
     <w:p>
       <w:pPr>
@@ -4741,11 +4885,11 @@
       <w:pPr>
         <w:pStyle w:val="Heading3"/>
       </w:pPr>
-      <w:bookmarkStart w:id="30" w:name="效应是一个有方向的单一量两个宿主一致"/>
+      <w:bookmarkStart w:id="31" w:name="效应是一个有方向的单一量两个宿主一致"/>
       <w:r>
         <w:t xml:space="preserve">5.2 效应是一个有方向的单一量，两个宿主一致</w:t>
       </w:r>
-      <w:bookmarkEnd w:id="30"/>
+      <w:bookmarkEnd w:id="31"/>
     </w:p>
     <w:p>
       <w:pPr>
@@ -5330,11 +5474,11 @@
       <w:pPr>
         <w:pStyle w:val="Heading3"/>
       </w:pPr>
-      <w:bookmarkStart w:id="31" w:name="这一节没有解决的问题"/>
+      <w:bookmarkStart w:id="32" w:name="这一节没有解决的问题"/>
       <w:r>
         <w:t xml:space="preserve">5.3 这一节没有解决的问题</w:t>
       </w:r>
-      <w:bookmarkEnd w:id="31"/>
+      <w:bookmarkEnd w:id="32"/>
     </w:p>
     <w:p>
       <w:pPr>
@@ -5395,11 +5539,11 @@
       <w:pPr>
         <w:pStyle w:val="Heading2"/>
       </w:pPr>
-      <w:bookmarkStart w:id="32" w:name="全部合并会不会更好"/>
+      <w:bookmarkStart w:id="33" w:name="全部合并会不会更好"/>
       <w:r>
         <w:t xml:space="preserve">6. 全部合并会不会更好</w:t>
       </w:r>
-      <w:bookmarkEnd w:id="32"/>
+      <w:bookmarkEnd w:id="33"/>
     </w:p>
     <w:p>
       <w:pPr>
@@ -5419,11 +5563,11 @@
       <w:pPr>
         <w:pStyle w:val="Heading3"/>
       </w:pPr>
-      <w:bookmarkStart w:id="33" w:name="队列内没有增益"/>
+      <w:bookmarkStart w:id="34" w:name="队列内没有增益"/>
       <w:r>
         <w:t xml:space="preserve">6.1 队列内：没有增益</w:t>
       </w:r>
-      <w:bookmarkEnd w:id="33"/>
+      <w:bookmarkEnd w:id="34"/>
     </w:p>
     <w:tbl>
       <w:tblPr>
@@ -5843,11 +5987,11 @@
       <w:pPr>
         <w:pStyle w:val="Heading3"/>
       </w:pPr>
-      <w:bookmarkStart w:id="34" w:name="跨宿主迁移被彻底破坏"/>
+      <w:bookmarkStart w:id="35" w:name="跨宿主迁移被彻底破坏"/>
       <w:r>
         <w:t xml:space="preserve">6.2 跨宿主：迁移被彻底破坏</w:t>
       </w:r>
-      <w:bookmarkEnd w:id="34"/>
+      <w:bookmarkEnd w:id="35"/>
     </w:p>
     <w:tbl>
       <w:tblPr>
@@ -6101,11 +6245,11 @@
       <w:pPr>
         <w:pStyle w:val="Heading3"/>
       </w:pPr>
-      <w:bookmarkStart w:id="35" w:name="笼效应原封不动地继承"/>
+      <w:bookmarkStart w:id="36" w:name="笼效应原封不动地继承"/>
       <w:r>
         <w:t xml:space="preserve">6.3 笼效应：原封不动地继承</w:t>
       </w:r>
-      <w:bookmarkEnd w:id="35"/>
+      <w:bookmarkEnd w:id="36"/>
     </w:p>
     <w:tbl>
       <w:tblPr>
@@ -6472,11 +6616,11 @@
       <w:pPr>
         <w:pStyle w:val="Heading3"/>
       </w:pPr>
-      <w:bookmarkStart w:id="36" w:name="结论"/>
+      <w:bookmarkStart w:id="37" w:name="结论"/>
       <w:r>
         <w:t xml:space="preserve">6.4 结论</w:t>
       </w:r>
-      <w:bookmarkEnd w:id="36"/>
+      <w:bookmarkEnd w:id="37"/>
     </w:p>
     <w:p>
       <w:pPr>
@@ -6521,21 +6665,21 @@
       <w:pPr>
         <w:pStyle w:val="Heading2"/>
       </w:pPr>
-      <w:bookmarkStart w:id="37" w:name="生态类模型里该用哪个"/>
+      <w:bookmarkStart w:id="38" w:name="生态类模型里该用哪个"/>
       <w:r>
         <w:t xml:space="preserve">7. 生态类模型里该用哪个</w:t>
       </w:r>
-      <w:bookmarkEnd w:id="37"/>
+      <w:bookmarkEnd w:id="38"/>
     </w:p>
     <w:p>
       <w:pPr>
         <w:pStyle w:val="Heading3"/>
       </w:pPr>
-      <w:bookmarkStart w:id="38" w:name="先确立判断标准比较才有意义"/>
+      <w:bookmarkStart w:id="39" w:name="先确立判断标准比较才有意义"/>
       <w:r>
         <w:t xml:space="preserve">7.1 先确立判断标准，比较才有意义</w:t>
       </w:r>
-      <w:bookmarkEnd w:id="38"/>
+      <w:bookmarkEnd w:id="39"/>
     </w:p>
     <w:tbl>
       <w:tblPr>
@@ -7367,11 +7511,11 @@
       <w:pPr>
         <w:pStyle w:val="Heading3"/>
       </w:pPr>
-      <w:bookmarkStart w:id="39" w:name="按这两条评核心保留度胜出"/>
+      <w:bookmarkStart w:id="40" w:name="按这两条评核心保留度胜出"/>
       <w:r>
         <w:t xml:space="preserve">7.2 按这两条评，核心保留度胜出</w:t>
       </w:r>
-      <w:bookmarkEnd w:id="39"/>
+      <w:bookmarkEnd w:id="40"/>
     </w:p>
     <w:p>
       <w:pPr>
@@ -7539,11 +7683,11 @@
       <w:pPr>
         <w:pStyle w:val="Heading3"/>
       </w:pPr>
-      <w:bookmarkStart w:id="40" w:name="三条使用规则"/>
+      <w:bookmarkStart w:id="41" w:name="三条使用规则"/>
       <w:r>
         <w:t xml:space="preserve">7.3 三条使用规则</w:t>
       </w:r>
-      <w:bookmarkEnd w:id="40"/>
+      <w:bookmarkEnd w:id="41"/>
     </w:p>
     <w:p>
       <w:pPr>
@@ -7612,11 +7756,11 @@
       <w:pPr>
         <w:pStyle w:val="Heading3"/>
       </w:pPr>
-      <w:bookmarkStart w:id="41" w:name="一句话总结"/>
+      <w:bookmarkStart w:id="42" w:name="一句话总结"/>
       <w:r>
         <w:t xml:space="preserve">7.4 一句话总结</w:t>
       </w:r>
-      <w:bookmarkEnd w:id="41"/>
+      <w:bookmarkEnd w:id="42"/>
     </w:p>
     <w:tbl>
       <w:tblPr>
@@ -7736,11 +7880,11 @@
       <w:pPr>
         <w:pStyle w:val="Heading2"/>
       </w:pPr>
-      <w:bookmarkStart w:id="42" w:name="下一步"/>
+      <w:bookmarkStart w:id="43" w:name="下一步"/>
       <w:r>
         <w:t xml:space="preserve">8. 下一步</w:t>
       </w:r>
-      <w:bookmarkEnd w:id="42"/>
+      <w:bookmarkEnd w:id="43"/>
     </w:p>
     <w:p>
       <w:pPr>
@@ -7879,11 +8023,11 @@
       <w:pPr>
         <w:pStyle w:val="Heading2"/>
       </w:pPr>
-      <w:bookmarkStart w:id="43" w:name="复现"/>
+      <w:bookmarkStart w:id="44" w:name="复现"/>
       <w:r>
         <w:t xml:space="preserve">9. 复现</w:t>
       </w:r>
-      <w:bookmarkEnd w:id="43"/>
+      <w:bookmarkEnd w:id="44"/>
     </w:p>
     <w:p>
       <w:pPr>
@@ -8194,11 +8338,11 @@
       <w:pPr>
         <w:pStyle w:val="Heading2"/>
       </w:pPr>
-      <w:bookmarkStart w:id="44" w:name="尚未完成"/>
+      <w:bookmarkStart w:id="45" w:name="尚未完成"/>
       <w:r>
         <w:t xml:space="preserve">10. 尚未完成</w:t>
       </w:r>
-      <w:bookmarkEnd w:id="44"/>
+      <w:bookmarkEnd w:id="45"/>
     </w:p>
     <w:p>
       <w:pPr>

</xml_diff>